<commit_message>
Docs: mise a jour de la fiche technique et du manuel d'utilisation
</commit_message>
<xml_diff>
--- a/Fiche_Technique_GSRH.docx
+++ b/Fiche_Technique_GSRH.docx
@@ -225,6 +225,14 @@
               </w:rPr>
               <w:t>Application web de gestion RH + application mobile de pointage</w:t>
             </w:r>
+            <w:r>
+              <w:rPr>
+                <w:rFonts w:ascii="Bahnschrift Light" w:hAnsi="Bahnschrift Light"/>
+                <w:sz w:val="26"/>
+                <w:szCs w:val="26"/>
+              </w:rPr>
+              <w:t xml:space="preserve"> des présences </w:t>
+            </w:r>
           </w:p>
         </w:tc>
       </w:tr>
@@ -610,15 +618,7 @@
           <w:sz w:val="26"/>
           <w:szCs w:val="26"/>
         </w:rPr>
-        <w:t>Backend:</w:t>
-      </w:r>
-      <w:r>
-        <w:rPr>
-          <w:rFonts w:ascii="Bahnschrift Light" w:hAnsi="Bahnschrift Light"/>
-          <w:sz w:val="26"/>
-          <w:szCs w:val="26"/>
-        </w:rPr>
-        <w:t xml:space="preserve"> API REST Spring Boot connectée à SQL Server.</w:t>
+        <w:t>Backend: API REST Spring Boot connectée à SQL Server.</w:t>
       </w:r>
     </w:p>
     <w:p>
@@ -638,23 +638,13 @@
         </w:rPr>
         <w:t xml:space="preserve">Application mobile de </w:t>
       </w:r>
-      <w:proofErr w:type="spellStart"/>
       <w:r>
         <w:rPr>
           <w:rFonts w:ascii="Bahnschrift Light" w:hAnsi="Bahnschrift Light"/>
           <w:sz w:val="26"/>
           <w:szCs w:val="26"/>
         </w:rPr>
-        <w:t>pointage</w:t>
-      </w:r>
-      <w:proofErr w:type="spellEnd"/>
-      <w:r>
-        <w:rPr>
-          <w:rFonts w:ascii="Bahnschrift Light" w:hAnsi="Bahnschrift Light"/>
-          <w:sz w:val="26"/>
-          <w:szCs w:val="26"/>
-        </w:rPr>
-        <w:t>:</w:t>
+        <w:t>pointage:</w:t>
       </w:r>
       <w:r>
         <w:rPr>

</xml_diff>